<commit_message>
Remove the added review note from the ELDA Lead Teams data sheet
Co-Authored-By: Claude Fable 5.1 <noreply@anthropic.com>
Claude-Session: https://claude.ai/code/session_01LgFPs3fMSncBgbYQ3PfA3o
</commit_message>
<xml_diff>
--- a/output/elda-lead-teams-data-sheet.docx
+++ b/output/elda-lead-teams-data-sheet.docx
@@ -2399,26 +2399,6 @@
           <w:i w:val="false"/>
         </w:rPr>
         <w:t>Learning and individual development identified during ELDA Lead Teams should be carried forward through subsequent A1530 learning activities to support continued reflection and deliberate leadership development.</w:t>
-      </w:r>
-    </w:p>
-    <w:p>
-      <w:pPr>
-        <w:pStyle w:val="Normal"/>
-        <w:pBdr>
-          <w:left w:val="single" w:sz="28" w:space="8" w:color="C62026"/>
-        </w:pBdr>
-        <w:shd w:val="clear" w:color="auto" w:fill="CDD2B7"/>
-        <w:spacing w:before="160" w:after="160"/>
-        <w:ind w:left="283" w:right="283"/>
-        <w:rPr/>
-      </w:pPr>
-      <w:r>
-        <w:rPr>
-          <w:rFonts w:cs="Book Antiqua"/>
-          <w:b/>
-          <w:i w:val="false"/>
-        </w:rPr>
-        <w:t>Review note: Note 2 uses "initial phase" rather than "first week". The course is six training days, so "first week" created an unnecessary internal inconsistency.</w:t>
       </w:r>
     </w:p>
     <w:p>

</xml_diff>

<commit_message>
Remove em dashes from the ELDA Lead Teams data sheet
Co-Authored-By: Claude Fable 5.1 <noreply@anthropic.com>
Claude-Session: https://claude.ai/code/session_01LgFPs3fMSncBgbYQ3PfA3o
</commit_message>
<xml_diff>
--- a/output/elda-lead-teams-data-sheet.docx
+++ b/output/elda-lead-teams-data-sheet.docx
@@ -62,7 +62,7 @@
           <w:color w:val="000000"/>
           <w:sz w:val="40"/>
         </w:rPr>
-        <w:t>A18011 — ELDA Lead Teams</w:t>
+        <w:t>A18011 ELDA Lead Teams</w:t>
       </w:r>
     </w:p>
     <w:p>
@@ -81,7 +81,7 @@
           <w:color w:val="002516"/>
           <w:sz w:val="24"/>
         </w:rPr>
-        <w:t>Course Data Sheet — Revised Entries for AL 3.0</w:t>
+        <w:t>Course Data Sheet: Revised Entries for AL 3.0</w:t>
       </w:r>
     </w:p>
     <w:p>
@@ -1029,7 +1029,7 @@
           <w:color w:val="002516"/>
           <w:sz w:val="21"/>
         </w:rPr>
-        <w:t>Manual Checks — Learning Provider Checks</w:t>
+        <w:t>Manual Checks: Learning Provider Checks</w:t>
       </w:r>
     </w:p>
     <w:p>
@@ -2435,7 +2435,7 @@
           <w:color w:val="002516"/>
           <w:sz w:val="21"/>
         </w:rPr>
-        <w:t>COG 1 — Experiential Leadership Development</w:t>
+        <w:t>COG 1: Experiential Leadership Development</w:t>
       </w:r>
     </w:p>
     <w:p>
@@ -2453,7 +2453,7 @@
           <w:color w:val="000000"/>
           <w:sz w:val="20"/>
         </w:rPr>
-        <w:t>LO 1.1 — Apply strategies to maintain effective performance under pressure</w:t>
+        <w:t>LO 1.1: Apply strategies to maintain effective performance under pressure</w:t>
       </w:r>
     </w:p>
     <w:p>
@@ -2499,7 +2499,7 @@
           <w:color w:val="000000"/>
           <w:sz w:val="20"/>
         </w:rPr>
-        <w:t>LO 1.2 — Apply effective leadership behaviours within a small team under challenging conditions</w:t>
+        <w:t>LO 1.2: Apply effective leadership behaviours within a small team under challenging conditions</w:t>
       </w:r>
     </w:p>
     <w:p>
@@ -2545,7 +2545,7 @@
           <w:color w:val="000000"/>
           <w:sz w:val="20"/>
         </w:rPr>
-        <w:t>LO 1.3 — Evaluate personal leadership performance and develop an individual leadership development plan</w:t>
+        <w:t>LO 1.3: Evaluate personal leadership performance and develop an individual leadership development plan</w:t>
       </w:r>
     </w:p>
     <w:p>
@@ -2595,7 +2595,7 @@
           <w:color w:val="002516"/>
           <w:sz w:val="24"/>
         </w:rPr>
-        <w:t>Annex — Learning Architecture</w:t>
+        <w:t>Annex: Learning Architecture</w:t>
       </w:r>
     </w:p>
     <w:p>
@@ -2686,7 +2686,7 @@
           <w:color w:val="002516"/>
           <w:sz w:val="18"/>
         </w:rPr>
-        <w:t>LO 1.1 — SELF</w:t>
+        <w:t>LO 1.1: SELF</w:t>
       </w:r>
       <w:r>
         <w:rPr/>
@@ -2739,7 +2739,7 @@
           <w:color w:val="002516"/>
           <w:sz w:val="18"/>
         </w:rPr>
-        <w:t>LO 1.2 — TEAM</w:t>
+        <w:t>LO 1.2: TEAM</w:t>
       </w:r>
       <w:r>
         <w:rPr/>
@@ -2792,7 +2792,7 @@
           <w:color w:val="002516"/>
           <w:sz w:val="18"/>
         </w:rPr>
-        <w:t>LO 1.3 — DEVELOPMENT</w:t>
+        <w:t>LO 1.3: DEVELOPMENT</w:t>
       </w:r>
       <w:r>
         <w:rPr/>

</xml_diff>

<commit_message>
Remove the review-note boxes from the ELDA Lead Teams data sheet
Co-Authored-By: Claude Fable 5.1 <noreply@anthropic.com>
Claude-Session: https://claude.ai/code/session_01LgFPs3fMSncBgbYQ3PfA3o
</commit_message>
<xml_diff>
--- a/output/elda-lead-teams-data-sheet.docx
+++ b/output/elda-lead-teams-data-sheet.docx
@@ -1060,26 +1060,6 @@
         <w:t>The course may involve periods of continuous physical activity of approximately 12–18 hours per day over four consecutive days without return to hard standing.</w:t>
       </w:r>
     </w:p>
-    <w:p>
-      <w:pPr>
-        <w:pStyle w:val="Normal"/>
-        <w:pBdr>
-          <w:left w:val="single" w:sz="28" w:space="8" w:color="C62026"/>
-        </w:pBdr>
-        <w:shd w:val="clear" w:color="auto" w:fill="CDD2B7"/>
-        <w:spacing w:before="160" w:after="160"/>
-        <w:ind w:left="283" w:right="283"/>
-        <w:rPr/>
-      </w:pPr>
-      <w:r>
-        <w:rPr>
-          <w:rFonts w:cs="Book Antiqua"/>
-          <w:b/>
-          <w:i w:val="false"/>
-        </w:rPr>
-        <w:t>Review note: This requirement should be checked against the current NZALC Safety Management Plan, activity SOPs and applicable NZDF medical policy before publication.</w:t>
-      </w:r>
-    </w:p>
     <w:tbl>
       <w:tblPr>
         <w:tblW w:w="9298" w:type="dxa"/>
@@ -2078,26 +2058,6 @@
           <w:i w:val="false"/>
         </w:rPr>
         <w:t xml:space="preserve"> A minimum instructor-to-learner ratio of 1:8 is to be maintained for field-based activities.</w:t>
-      </w:r>
-    </w:p>
-    <w:p>
-      <w:pPr>
-        <w:pStyle w:val="Normal"/>
-        <w:pBdr>
-          <w:left w:val="single" w:sz="28" w:space="8" w:color="C62026"/>
-        </w:pBdr>
-        <w:shd w:val="clear" w:color="auto" w:fill="CDD2B7"/>
-        <w:spacing w:before="160" w:after="160"/>
-        <w:ind w:left="283" w:right="283"/>
-        <w:rPr/>
-      </w:pPr>
-      <w:r>
-        <w:rPr>
-          <w:rFonts w:cs="Book Antiqua"/>
-          <w:b/>
-          <w:i w:val="false"/>
-        </w:rPr>
-        <w:t>Review note: Confirm the exact qualification/SOP reference remains current before publication.</w:t>
       </w:r>
     </w:p>
     <w:p>

</xml_diff>

<commit_message>
Apply markup to the ELDA Lead Teams data sheet
Shorten the subtitle to Course Data Sheet, drop the Version field and
the red bars beside section headings, and remove the learning
architecture annex.

Co-Authored-By: Claude Fable 5.1 <noreply@anthropic.com>
Claude-Session: https://claude.ai/code/session_01LgFPs3fMSncBgbYQ3PfA3o
</commit_message>
<xml_diff>
--- a/output/elda-lead-teams-data-sheet.docx
+++ b/output/elda-lead-teams-data-sheet.docx
@@ -81,7 +81,7 @@
           <w:color w:val="002516"/>
           <w:sz w:val="24"/>
         </w:rPr>
-        <w:t>Course Data Sheet: Revised Entries for AL 3.0</w:t>
+        <w:t>Course Data Sheet</w:t>
       </w:r>
     </w:p>
     <w:p>
@@ -148,36 +148,10 @@
         </w:rPr>
         <w:t>September 2026</w:t>
       </w:r>
-      <w:r>
-        <w:rPr>
-          <w:rFonts w:cs="Arial" w:ascii="Arial" w:hAnsi="Arial"/>
-        </w:rPr>
-        <w:t xml:space="preserve">      </w:t>
-      </w:r>
-      <w:r>
-        <w:rPr>
-          <w:rFonts w:cs="Arial" w:ascii="Arial" w:hAnsi="Arial"/>
-          <w:b/>
-          <w:color w:val="002516"/>
-          <w:sz w:val="18"/>
-        </w:rPr>
-        <w:t xml:space="preserve">Version  </w:t>
-      </w:r>
-      <w:r>
-        <w:rPr>
-          <w:rFonts w:cs="Arial" w:ascii="Arial" w:hAnsi="Arial"/>
-          <w:color w:val="000000"/>
-          <w:sz w:val="18"/>
-        </w:rPr>
-        <w:t>Revised draft v0.1</w:t>
-      </w:r>
     </w:p>
     <w:p>
       <w:pPr>
         <w:pStyle w:val="Heading1"/>
-        <w:pBdr>
-          <w:left w:val="single" w:sz="24" w:space="8" w:color="C62026"/>
-        </w:pBdr>
         <w:rPr/>
       </w:pPr>
       <w:r>
@@ -970,9 +944,6 @@
     <w:p>
       <w:pPr>
         <w:pStyle w:val="Heading1"/>
-        <w:pBdr>
-          <w:left w:val="single" w:sz="24" w:space="8" w:color="C62026"/>
-        </w:pBdr>
         <w:rPr/>
       </w:pPr>
       <w:r>
@@ -1582,9 +1553,6 @@
     <w:p>
       <w:pPr>
         <w:pStyle w:val="Heading1"/>
-        <w:pBdr>
-          <w:left w:val="single" w:sz="24" w:space="8" w:color="C62026"/>
-        </w:pBdr>
         <w:rPr/>
       </w:pPr>
       <w:r>
@@ -2063,9 +2031,6 @@
     <w:p>
       <w:pPr>
         <w:pStyle w:val="Heading1"/>
-        <w:pBdr>
-          <w:left w:val="single" w:sz="24" w:space="8" w:color="C62026"/>
-        </w:pBdr>
         <w:rPr/>
       </w:pPr>
       <w:r>
@@ -2364,9 +2329,6 @@
     <w:p>
       <w:pPr>
         <w:pStyle w:val="Heading1"/>
-        <w:pBdr>
-          <w:left w:val="single" w:sz="24" w:space="8" w:color="C62026"/>
-        </w:pBdr>
         <w:rPr/>
       </w:pPr>
       <w:r>
@@ -2520,315 +2482,6 @@
           <w:i w:val="false"/>
         </w:rPr>
         <w:t>Learners critically reflect on their performance and leadership behaviours demonstrated throughout ELDA Lead Teams, identify strengths and areas for development, and develop an individual leadership development plan to support continued development throughout the A1530 JNCO Course and beyond.</w:t>
-      </w:r>
-    </w:p>
-    <w:p>
-      <w:pPr>
-        <w:pStyle w:val="Normal"/>
-        <w:rPr/>
-      </w:pPr>
-      <w:r>
-        <w:rPr>
-          <w:rFonts w:cs="Book Antiqua"/>
-          <w:b w:val="false"/>
-          <w:i w:val="false"/>
-        </w:rPr>
-        <w:t>The three LO titles are assessable as written. Enabling objectives, learning content, activities and the evidence required against each LO are defined in the syllabus, not in this data sheet.</w:t>
-      </w:r>
-      <w:r>
-        <w:br w:type="page"/>
-      </w:r>
-    </w:p>
-    <w:p>
-      <w:pPr>
-        <w:pStyle w:val="Heading1"/>
-        <w:pBdr>
-          <w:left w:val="single" w:sz="24" w:space="8" w:color="C62026"/>
-        </w:pBdr>
-        <w:rPr/>
-      </w:pPr>
-      <w:r>
-        <w:rPr>
-          <w:rFonts w:cs="Arial" w:ascii="Arial" w:hAnsi="Arial"/>
-          <w:b/>
-          <w:i w:val="false"/>
-          <w:color w:val="002516"/>
-          <w:sz w:val="24"/>
-        </w:rPr>
-        <w:t>Annex: Learning Architecture</w:t>
-      </w:r>
-    </w:p>
-    <w:p>
-      <w:pPr>
-        <w:pStyle w:val="Normal"/>
-        <w:rPr/>
-      </w:pPr>
-      <w:r>
-        <w:rPr>
-          <w:rFonts w:cs="Book Antiqua"/>
-          <w:b w:val="false"/>
-          <w:i w:val="false"/>
-        </w:rPr>
-        <w:t>The data sheet now has a single line of intent running from the course aim, through the three learning outcomes, to the next step.</w:t>
-      </w:r>
-    </w:p>
-    <w:p>
-      <w:pPr>
-        <w:pStyle w:val="Normal"/>
-        <w:keepNext w:val="true"/>
-        <w:pBdr>
-          <w:left w:val="single" w:sz="28" w:space="8" w:color="C62026"/>
-        </w:pBdr>
-        <w:shd w:val="clear" w:color="auto" w:fill="CDD2B7"/>
-        <w:spacing w:before="40" w:after="40"/>
-        <w:ind w:left="1701" w:right="1701"/>
-        <w:jc w:val="center"/>
-        <w:rPr/>
-      </w:pPr>
-      <w:r>
-        <w:rPr>
-          <w:rFonts w:cs="Arial" w:ascii="Arial" w:hAnsi="Arial"/>
-          <w:b/>
-          <w:i w:val="false"/>
-          <w:color w:val="002516"/>
-          <w:sz w:val="18"/>
-        </w:rPr>
-        <w:t>COURSE AIM</w:t>
-      </w:r>
-      <w:r>
-        <w:rPr/>
-        <w:br/>
-      </w:r>
-      <w:r>
-        <w:rPr>
-          <w:rFonts w:cs="Book Antiqua"/>
-          <w:b w:val="false"/>
-          <w:i w:val="false"/>
-          <w:sz w:val="20"/>
-        </w:rPr>
-        <w:t>Develop leadership effectiveness</w:t>
-      </w:r>
-    </w:p>
-    <w:p>
-      <w:pPr>
-        <w:pStyle w:val="Normal"/>
-        <w:spacing w:before="0" w:after="0"/>
-        <w:jc w:val="center"/>
-        <w:rPr/>
-      </w:pPr>
-      <w:r>
-        <w:rPr>
-          <w:rFonts w:cs="Arial" w:ascii="Arial" w:hAnsi="Arial"/>
-          <w:color w:val="C62026"/>
-          <w:sz w:val="18"/>
-        </w:rPr>
-        <w:t>▼</w:t>
-      </w:r>
-    </w:p>
-    <w:p>
-      <w:pPr>
-        <w:pStyle w:val="Normal"/>
-        <w:keepNext w:val="true"/>
-        <w:pBdr>
-          <w:left w:val="single" w:sz="28" w:space="8" w:color="C62026"/>
-        </w:pBdr>
-        <w:shd w:val="clear" w:color="auto" w:fill="CDD2B7"/>
-        <w:spacing w:before="40" w:after="40"/>
-        <w:ind w:left="1701" w:right="1701"/>
-        <w:jc w:val="center"/>
-        <w:rPr/>
-      </w:pPr>
-      <w:r>
-        <w:rPr>
-          <w:rFonts w:cs="Arial" w:ascii="Arial" w:hAnsi="Arial"/>
-          <w:b/>
-          <w:i w:val="false"/>
-          <w:color w:val="002516"/>
-          <w:sz w:val="18"/>
-        </w:rPr>
-        <w:t>LO 1.1: SELF</w:t>
-      </w:r>
-      <w:r>
-        <w:rPr/>
-        <w:br/>
-      </w:r>
-      <w:r>
-        <w:rPr>
-          <w:rFonts w:cs="Book Antiqua"/>
-          <w:b w:val="false"/>
-          <w:i w:val="false"/>
-          <w:sz w:val="20"/>
-        </w:rPr>
-        <w:t>Maintain personal effectiveness under pressure</w:t>
-      </w:r>
-    </w:p>
-    <w:p>
-      <w:pPr>
-        <w:pStyle w:val="Normal"/>
-        <w:spacing w:before="0" w:after="0"/>
-        <w:jc w:val="center"/>
-        <w:rPr/>
-      </w:pPr>
-      <w:r>
-        <w:rPr>
-          <w:rFonts w:cs="Arial" w:ascii="Arial" w:hAnsi="Arial"/>
-          <w:color w:val="C62026"/>
-          <w:sz w:val="18"/>
-        </w:rPr>
-        <w:t>▼</w:t>
-      </w:r>
-    </w:p>
-    <w:p>
-      <w:pPr>
-        <w:pStyle w:val="Normal"/>
-        <w:keepNext w:val="true"/>
-        <w:pBdr>
-          <w:left w:val="single" w:sz="28" w:space="8" w:color="C62026"/>
-        </w:pBdr>
-        <w:shd w:val="clear" w:color="auto" w:fill="CDD2B7"/>
-        <w:spacing w:before="40" w:after="40"/>
-        <w:ind w:left="1701" w:right="1701"/>
-        <w:jc w:val="center"/>
-        <w:rPr/>
-      </w:pPr>
-      <w:r>
-        <w:rPr>
-          <w:rFonts w:cs="Arial" w:ascii="Arial" w:hAnsi="Arial"/>
-          <w:b/>
-          <w:i w:val="false"/>
-          <w:color w:val="002516"/>
-          <w:sz w:val="18"/>
-        </w:rPr>
-        <w:t>LO 1.2: TEAM</w:t>
-      </w:r>
-      <w:r>
-        <w:rPr/>
-        <w:br/>
-      </w:r>
-      <w:r>
-        <w:rPr>
-          <w:rFonts w:cs="Book Antiqua"/>
-          <w:b w:val="false"/>
-          <w:i w:val="false"/>
-          <w:sz w:val="20"/>
-        </w:rPr>
-        <w:t>Apply leadership behaviours with others under pressure</w:t>
-      </w:r>
-    </w:p>
-    <w:p>
-      <w:pPr>
-        <w:pStyle w:val="Normal"/>
-        <w:spacing w:before="0" w:after="0"/>
-        <w:jc w:val="center"/>
-        <w:rPr/>
-      </w:pPr>
-      <w:r>
-        <w:rPr>
-          <w:rFonts w:cs="Arial" w:ascii="Arial" w:hAnsi="Arial"/>
-          <w:color w:val="C62026"/>
-          <w:sz w:val="18"/>
-        </w:rPr>
-        <w:t>▼</w:t>
-      </w:r>
-    </w:p>
-    <w:p>
-      <w:pPr>
-        <w:pStyle w:val="Normal"/>
-        <w:keepNext w:val="true"/>
-        <w:pBdr>
-          <w:left w:val="single" w:sz="28" w:space="8" w:color="C62026"/>
-        </w:pBdr>
-        <w:shd w:val="clear" w:color="auto" w:fill="CDD2B7"/>
-        <w:spacing w:before="40" w:after="40"/>
-        <w:ind w:left="1701" w:right="1701"/>
-        <w:jc w:val="center"/>
-        <w:rPr/>
-      </w:pPr>
-      <w:r>
-        <w:rPr>
-          <w:rFonts w:cs="Arial" w:ascii="Arial" w:hAnsi="Arial"/>
-          <w:b/>
-          <w:i w:val="false"/>
-          <w:color w:val="002516"/>
-          <w:sz w:val="18"/>
-        </w:rPr>
-        <w:t>LO 1.3: DEVELOPMENT</w:t>
-      </w:r>
-      <w:r>
-        <w:rPr/>
-        <w:br/>
-      </w:r>
-      <w:r>
-        <w:rPr>
-          <w:rFonts w:cs="Book Antiqua"/>
-          <w:b w:val="false"/>
-          <w:i w:val="false"/>
-          <w:sz w:val="20"/>
-        </w:rPr>
-        <w:t>Evaluate how I led and what I need to develop</w:t>
-      </w:r>
-    </w:p>
-    <w:p>
-      <w:pPr>
-        <w:pStyle w:val="Normal"/>
-        <w:spacing w:before="0" w:after="0"/>
-        <w:jc w:val="center"/>
-        <w:rPr/>
-      </w:pPr>
-      <w:r>
-        <w:rPr>
-          <w:rFonts w:cs="Arial" w:ascii="Arial" w:hAnsi="Arial"/>
-          <w:color w:val="C62026"/>
-          <w:sz w:val="18"/>
-        </w:rPr>
-        <w:t>▼</w:t>
-      </w:r>
-    </w:p>
-    <w:p>
-      <w:pPr>
-        <w:pStyle w:val="Normal"/>
-        <w:keepNext w:val="true"/>
-        <w:pBdr>
-          <w:left w:val="single" w:sz="28" w:space="8" w:color="C62026"/>
-        </w:pBdr>
-        <w:shd w:val="clear" w:color="auto" w:fill="CDD2B7"/>
-        <w:spacing w:before="40" w:after="40"/>
-        <w:ind w:left="1701" w:right="1701"/>
-        <w:jc w:val="center"/>
-        <w:rPr/>
-      </w:pPr>
-      <w:r>
-        <w:rPr>
-          <w:rFonts w:cs="Arial" w:ascii="Arial" w:hAnsi="Arial"/>
-          <w:b/>
-          <w:i w:val="false"/>
-          <w:color w:val="002516"/>
-          <w:sz w:val="18"/>
-        </w:rPr>
-        <w:t>NEXT STEP</w:t>
-      </w:r>
-      <w:r>
-        <w:rPr/>
-        <w:br/>
-      </w:r>
-      <w:r>
-        <w:rPr>
-          <w:rFonts w:cs="Book Antiqua"/>
-          <w:b w:val="false"/>
-          <w:i w:val="false"/>
-          <w:sz w:val="20"/>
-        </w:rPr>
-        <w:t>Apply, reflect and deliberately develop throughout JNCO and the workplace</w:t>
-      </w:r>
-    </w:p>
-    <w:p>
-      <w:pPr>
-        <w:pStyle w:val="Normal"/>
-        <w:spacing w:before="0" w:after="120"/>
-        <w:rPr/>
-      </w:pPr>
-      <w:r>
-        <w:rPr/>
       </w:r>
     </w:p>
     <w:p>
@@ -2846,7 +2499,7 @@
           <w:b w:val="false"/>
           <w:i w:val="false"/>
         </w:rPr>
-        <w:t>ELDA Lead Teams creates an intense experiential baseline and an initial development plan. The Leadership Journal then provides the mechanism for learners to keep testing and reflecting on that leadership throughout the broader A1530 JNCO Course.</w:t>
+        <w:t>The three LO titles are assessable as written. Enabling objectives, learning content, activities and the evidence required against each LO are defined in the syllabus, not in this data sheet.</w:t>
       </w:r>
     </w:p>
     <w:sectPr>
@@ -2950,7 +2603,7 @@
         <w:sz w:val="17"/>
         <w:rFonts w:cs="Arial" w:ascii="Arial" w:hAnsi="Arial"/>
       </w:rPr>
-      <w:t>4</w:t>
+      <w:t>3</w:t>
     </w:r>
     <w:r>
       <w:rPr>
@@ -2993,7 +2646,7 @@
         <w:sz w:val="17"/>
         <w:rFonts w:cs="Arial" w:ascii="Arial" w:hAnsi="Arial"/>
       </w:rPr>
-      <w:t>4</w:t>
+      <w:t>3</w:t>
     </w:r>
     <w:r>
       <w:rPr>
@@ -3074,7 +2727,7 @@
         <w:sz w:val="17"/>
         <w:rFonts w:cs="Arial" w:ascii="Arial" w:hAnsi="Arial"/>
       </w:rPr>
-      <w:t>4</w:t>
+      <w:t>3</w:t>
     </w:r>
     <w:r>
       <w:rPr>
@@ -3117,7 +2770,7 @@
         <w:sz w:val="17"/>
         <w:rFonts w:cs="Arial" w:ascii="Arial" w:hAnsi="Arial"/>
       </w:rPr>
-      <w:t>4</w:t>
+      <w:t>3</w:t>
     </w:r>
     <w:r>
       <w:rPr>

</xml_diff>

<commit_message>
Set the ELDA Lead Teams data sheet body text in Arial
Co-Authored-By: Claude Fable 5.1 <noreply@anthropic.com>
Claude-Session: https://claude.ai/code/session_01LgFPs3fMSncBgbYQ3PfA3o
</commit_message>
<xml_diff>
--- a/output/elda-lead-teams-data-sheet.docx
+++ b/output/elda-lead-teams-data-sheet.docx
@@ -57,7 +57,7 @@
       </w:pPr>
       <w:r>
         <w:rPr>
-          <w:rFonts w:cs="Arial" w:ascii="Arial" w:hAnsi="Arial"/>
+          <w:rFonts w:cs="Arial"/>
           <w:b/>
           <w:color w:val="000000"/>
           <w:sz w:val="40"/>
@@ -76,7 +76,7 @@
       </w:pPr>
       <w:r>
         <w:rPr>
-          <w:rFonts w:cs="Arial" w:ascii="Arial" w:hAnsi="Arial"/>
+          <w:rFonts w:cs="Arial"/>
           <w:b/>
           <w:color w:val="002516"/>
           <w:sz w:val="24"/>
@@ -92,7 +92,7 @@
       </w:pPr>
       <w:r>
         <w:rPr>
-          <w:rFonts w:cs="Arial" w:ascii="Arial" w:hAnsi="Arial"/>
+          <w:rFonts w:cs="Arial"/>
           <w:color w:val="002516"/>
           <w:sz w:val="21"/>
         </w:rPr>
@@ -110,7 +110,7 @@
       </w:pPr>
       <w:r>
         <w:rPr>
-          <w:rFonts w:cs="Arial" w:ascii="Arial" w:hAnsi="Arial"/>
+          <w:rFonts w:cs="Arial"/>
           <w:b/>
           <w:color w:val="002516"/>
           <w:sz w:val="18"/>
@@ -119,7 +119,7 @@
       </w:r>
       <w:r>
         <w:rPr>
-          <w:rFonts w:cs="Arial" w:ascii="Arial" w:hAnsi="Arial"/>
+          <w:rFonts w:cs="Arial"/>
           <w:color w:val="000000"/>
           <w:sz w:val="18"/>
         </w:rPr>
@@ -127,13 +127,13 @@
       </w:r>
       <w:r>
         <w:rPr>
-          <w:rFonts w:cs="Arial" w:ascii="Arial" w:hAnsi="Arial"/>
+          <w:rFonts w:cs="Arial"/>
         </w:rPr>
         <w:t xml:space="preserve">      </w:t>
       </w:r>
       <w:r>
         <w:rPr>
-          <w:rFonts w:cs="Arial" w:ascii="Arial" w:hAnsi="Arial"/>
+          <w:rFonts w:cs="Arial"/>
           <w:b/>
           <w:color w:val="002516"/>
           <w:sz w:val="18"/>
@@ -142,7 +142,7 @@
       </w:r>
       <w:r>
         <w:rPr>
-          <w:rFonts w:cs="Arial" w:ascii="Arial" w:hAnsi="Arial"/>
+          <w:rFonts w:cs="Arial"/>
           <w:color w:val="000000"/>
           <w:sz w:val="18"/>
         </w:rPr>
@@ -156,7 +156,7 @@
       </w:pPr>
       <w:r>
         <w:rPr>
-          <w:rFonts w:cs="Arial" w:ascii="Arial" w:hAnsi="Arial"/>
+          <w:rFonts w:cs="Arial"/>
           <w:b/>
           <w:i w:val="false"/>
           <w:color w:val="002516"/>
@@ -206,7 +206,7 @@
             </w:pPr>
             <w:r>
               <w:rPr>
-                <w:rFonts w:cs="Arial" w:ascii="Arial" w:hAnsi="Arial"/>
+                <w:rFonts w:cs="Arial"/>
                 <w:b/>
                 <w:i w:val="false"/>
                 <w:color w:val="FFFFFF"/>
@@ -235,7 +235,7 @@
             </w:pPr>
             <w:r>
               <w:rPr>
-                <w:rFonts w:cs="Arial" w:ascii="Arial" w:hAnsi="Arial"/>
+                <w:rFonts w:cs="Arial"/>
                 <w:b/>
                 <w:i w:val="false"/>
                 <w:color w:val="FFFFFF"/>
@@ -269,7 +269,7 @@
             </w:pPr>
             <w:r>
               <w:rPr>
-                <w:rFonts w:cs="Arial" w:ascii="Arial" w:hAnsi="Arial"/>
+                <w:rFonts w:cs="Arial"/>
                 <w:b/>
                 <w:i w:val="false"/>
                 <w:color w:val="002516"/>
@@ -297,7 +297,7 @@
             </w:pPr>
             <w:r>
               <w:rPr>
-                <w:rFonts w:cs="Book Antiqua"/>
+                <w:rFonts w:cs="Arial"/>
                 <w:b w:val="false"/>
                 <w:i w:val="false"/>
                 <w:sz w:val="20"/>
@@ -330,7 +330,7 @@
             </w:pPr>
             <w:r>
               <w:rPr>
-                <w:rFonts w:cs="Arial" w:ascii="Arial" w:hAnsi="Arial"/>
+                <w:rFonts w:cs="Arial"/>
                 <w:b/>
                 <w:i w:val="false"/>
                 <w:color w:val="002516"/>
@@ -358,7 +358,7 @@
             </w:pPr>
             <w:r>
               <w:rPr>
-                <w:rFonts w:cs="Book Antiqua"/>
+                <w:rFonts w:cs="Arial"/>
                 <w:b w:val="false"/>
                 <w:i w:val="false"/>
                 <w:sz w:val="20"/>
@@ -391,7 +391,7 @@
             </w:pPr>
             <w:r>
               <w:rPr>
-                <w:rFonts w:cs="Arial" w:ascii="Arial" w:hAnsi="Arial"/>
+                <w:rFonts w:cs="Arial"/>
                 <w:b/>
                 <w:i w:val="false"/>
                 <w:color w:val="002516"/>
@@ -419,7 +419,7 @@
             </w:pPr>
             <w:r>
               <w:rPr>
-                <w:rFonts w:cs="Book Antiqua"/>
+                <w:rFonts w:cs="Arial"/>
                 <w:b w:val="false"/>
                 <w:i w:val="false"/>
                 <w:sz w:val="20"/>
@@ -452,7 +452,7 @@
             </w:pPr>
             <w:r>
               <w:rPr>
-                <w:rFonts w:cs="Arial" w:ascii="Arial" w:hAnsi="Arial"/>
+                <w:rFonts w:cs="Arial"/>
                 <w:b/>
                 <w:i w:val="false"/>
                 <w:color w:val="002516"/>
@@ -480,7 +480,7 @@
             </w:pPr>
             <w:r>
               <w:rPr>
-                <w:rFonts w:cs="Book Antiqua"/>
+                <w:rFonts w:cs="Arial"/>
                 <w:b w:val="false"/>
                 <w:i w:val="false"/>
                 <w:sz w:val="20"/>
@@ -513,7 +513,7 @@
             </w:pPr>
             <w:r>
               <w:rPr>
-                <w:rFonts w:cs="Arial" w:ascii="Arial" w:hAnsi="Arial"/>
+                <w:rFonts w:cs="Arial"/>
                 <w:b/>
                 <w:i w:val="false"/>
                 <w:color w:val="002516"/>
@@ -541,7 +541,7 @@
             </w:pPr>
             <w:r>
               <w:rPr>
-                <w:rFonts w:cs="Book Antiqua"/>
+                <w:rFonts w:cs="Arial"/>
                 <w:b w:val="false"/>
                 <w:i w:val="false"/>
                 <w:sz w:val="20"/>
@@ -574,7 +574,7 @@
             </w:pPr>
             <w:r>
               <w:rPr>
-                <w:rFonts w:cs="Arial" w:ascii="Arial" w:hAnsi="Arial"/>
+                <w:rFonts w:cs="Arial"/>
                 <w:b/>
                 <w:i w:val="false"/>
                 <w:color w:val="002516"/>
@@ -602,7 +602,7 @@
             </w:pPr>
             <w:r>
               <w:rPr>
-                <w:rFonts w:cs="Book Antiqua"/>
+                <w:rFonts w:cs="Arial"/>
                 <w:b w:val="false"/>
                 <w:i w:val="false"/>
                 <w:sz w:val="20"/>
@@ -635,7 +635,7 @@
             </w:pPr>
             <w:r>
               <w:rPr>
-                <w:rFonts w:cs="Arial" w:ascii="Arial" w:hAnsi="Arial"/>
+                <w:rFonts w:cs="Arial"/>
                 <w:b/>
                 <w:i w:val="false"/>
                 <w:color w:val="002516"/>
@@ -663,7 +663,7 @@
             </w:pPr>
             <w:r>
               <w:rPr>
-                <w:rFonts w:cs="Book Antiqua"/>
+                <w:rFonts w:cs="Arial"/>
                 <w:b w:val="false"/>
                 <w:i w:val="false"/>
                 <w:sz w:val="20"/>
@@ -696,7 +696,7 @@
             </w:pPr>
             <w:r>
               <w:rPr>
-                <w:rFonts w:cs="Arial" w:ascii="Arial" w:hAnsi="Arial"/>
+                <w:rFonts w:cs="Arial"/>
                 <w:b/>
                 <w:i w:val="false"/>
                 <w:color w:val="002516"/>
@@ -724,7 +724,7 @@
             </w:pPr>
             <w:r>
               <w:rPr>
-                <w:rFonts w:cs="Book Antiqua"/>
+                <w:rFonts w:cs="Arial"/>
                 <w:b w:val="false"/>
                 <w:i w:val="false"/>
                 <w:sz w:val="20"/>
@@ -757,7 +757,7 @@
             </w:pPr>
             <w:r>
               <w:rPr>
-                <w:rFonts w:cs="Arial" w:ascii="Arial" w:hAnsi="Arial"/>
+                <w:rFonts w:cs="Arial"/>
                 <w:b/>
                 <w:i w:val="false"/>
                 <w:color w:val="002516"/>
@@ -785,7 +785,7 @@
             </w:pPr>
             <w:r>
               <w:rPr>
-                <w:rFonts w:cs="Book Antiqua"/>
+                <w:rFonts w:cs="Arial"/>
                 <w:b w:val="false"/>
                 <w:i w:val="false"/>
                 <w:sz w:val="20"/>
@@ -818,7 +818,7 @@
             </w:pPr>
             <w:r>
               <w:rPr>
-                <w:rFonts w:cs="Arial" w:ascii="Arial" w:hAnsi="Arial"/>
+                <w:rFonts w:cs="Arial"/>
                 <w:b/>
                 <w:i w:val="false"/>
                 <w:color w:val="002516"/>
@@ -846,7 +846,7 @@
             </w:pPr>
             <w:r>
               <w:rPr>
-                <w:rFonts w:cs="Book Antiqua"/>
+                <w:rFonts w:cs="Arial"/>
                 <w:b w:val="false"/>
                 <w:i w:val="false"/>
                 <w:sz w:val="20"/>
@@ -879,7 +879,7 @@
             </w:pPr>
             <w:r>
               <w:rPr>
-                <w:rFonts w:cs="Arial" w:ascii="Arial" w:hAnsi="Arial"/>
+                <w:rFonts w:cs="Arial"/>
                 <w:b/>
                 <w:i w:val="false"/>
                 <w:color w:val="002516"/>
@@ -907,7 +907,7 @@
             </w:pPr>
             <w:r>
               <w:rPr>
-                <w:rFonts w:cs="Book Antiqua"/>
+                <w:rFonts w:cs="Arial"/>
                 <w:b w:val="false"/>
                 <w:i w:val="false"/>
                 <w:sz w:val="20"/>
@@ -920,7 +920,7 @@
             </w:r>
             <w:r>
               <w:rPr>
-                <w:rFonts w:cs="Book Antiqua"/>
+                <w:rFonts w:cs="Arial"/>
                 <w:b w:val="false"/>
                 <w:i w:val="false"/>
                 <w:sz w:val="20"/>
@@ -948,7 +948,7 @@
       </w:pPr>
       <w:r>
         <w:rPr>
-          <w:rFonts w:cs="Arial" w:ascii="Arial" w:hAnsi="Arial"/>
+          <w:rFonts w:cs="Arial"/>
           <w:b/>
           <w:i w:val="false"/>
           <w:color w:val="002516"/>
@@ -964,7 +964,7 @@
       </w:pPr>
       <w:r>
         <w:rPr>
-          <w:rFonts w:cs="Book Antiqua"/>
+          <w:rFonts w:cs="Arial"/>
           <w:b w:val="false"/>
           <w:i w:val="false"/>
         </w:rPr>
@@ -978,7 +978,7 @@
       </w:pPr>
       <w:r>
         <w:rPr>
-          <w:rFonts w:cs="Book Antiqua"/>
+          <w:rFonts w:cs="Arial"/>
           <w:b w:val="false"/>
           <w:i w:val="false"/>
         </w:rPr>
@@ -994,7 +994,7 @@
       </w:pPr>
       <w:r>
         <w:rPr>
-          <w:rFonts w:cs="Arial" w:ascii="Arial" w:hAnsi="Arial"/>
+          <w:rFonts w:cs="Arial"/>
           <w:b/>
           <w:i w:val="false"/>
           <w:color w:val="002516"/>
@@ -1010,7 +1010,7 @@
       </w:pPr>
       <w:r>
         <w:rPr>
-          <w:rFonts w:cs="Book Antiqua"/>
+          <w:rFonts w:cs="Arial"/>
           <w:b w:val="false"/>
           <w:i w:val="false"/>
         </w:rPr>
@@ -1024,7 +1024,7 @@
       </w:pPr>
       <w:r>
         <w:rPr>
-          <w:rFonts w:cs="Book Antiqua"/>
+          <w:rFonts w:cs="Arial"/>
           <w:b w:val="false"/>
           <w:i w:val="false"/>
         </w:rPr>
@@ -1072,7 +1072,7 @@
             </w:pPr>
             <w:r>
               <w:rPr>
-                <w:rFonts w:cs="Arial" w:ascii="Arial" w:hAnsi="Arial"/>
+                <w:rFonts w:cs="Arial"/>
                 <w:b/>
                 <w:i w:val="false"/>
                 <w:color w:val="FFFFFF"/>
@@ -1101,7 +1101,7 @@
             </w:pPr>
             <w:r>
               <w:rPr>
-                <w:rFonts w:cs="Arial" w:ascii="Arial" w:hAnsi="Arial"/>
+                <w:rFonts w:cs="Arial"/>
                 <w:b/>
                 <w:i w:val="false"/>
                 <w:color w:val="FFFFFF"/>
@@ -1135,7 +1135,7 @@
             </w:pPr>
             <w:r>
               <w:rPr>
-                <w:rFonts w:cs="Arial" w:ascii="Arial" w:hAnsi="Arial"/>
+                <w:rFonts w:cs="Arial"/>
                 <w:b/>
                 <w:i w:val="false"/>
                 <w:color w:val="002516"/>
@@ -1163,7 +1163,7 @@
             </w:pPr>
             <w:r>
               <w:rPr>
-                <w:rFonts w:cs="Book Antiqua"/>
+                <w:rFonts w:cs="Arial"/>
                 <w:b w:val="false"/>
                 <w:i w:val="false"/>
                 <w:sz w:val="20"/>
@@ -1196,7 +1196,7 @@
             </w:pPr>
             <w:r>
               <w:rPr>
-                <w:rFonts w:cs="Arial" w:ascii="Arial" w:hAnsi="Arial"/>
+                <w:rFonts w:cs="Arial"/>
                 <w:b/>
                 <w:i w:val="false"/>
                 <w:color w:val="002516"/>
@@ -1224,7 +1224,7 @@
             </w:pPr>
             <w:r>
               <w:rPr>
-                <w:rFonts w:cs="Book Antiqua"/>
+                <w:rFonts w:cs="Arial"/>
                 <w:b w:val="false"/>
                 <w:i w:val="false"/>
                 <w:sz w:val="20"/>
@@ -1257,7 +1257,7 @@
             </w:pPr>
             <w:r>
               <w:rPr>
-                <w:rFonts w:cs="Arial" w:ascii="Arial" w:hAnsi="Arial"/>
+                <w:rFonts w:cs="Arial"/>
                 <w:b/>
                 <w:i w:val="false"/>
                 <w:color w:val="002516"/>
@@ -1285,7 +1285,7 @@
             </w:pPr>
             <w:r>
               <w:rPr>
-                <w:rFonts w:cs="Book Antiqua"/>
+                <w:rFonts w:cs="Arial"/>
                 <w:b w:val="false"/>
                 <w:i w:val="false"/>
                 <w:sz w:val="20"/>
@@ -1318,7 +1318,7 @@
             </w:pPr>
             <w:r>
               <w:rPr>
-                <w:rFonts w:cs="Arial" w:ascii="Arial" w:hAnsi="Arial"/>
+                <w:rFonts w:cs="Arial"/>
                 <w:b/>
                 <w:i w:val="false"/>
                 <w:color w:val="002516"/>
@@ -1346,7 +1346,7 @@
             </w:pPr>
             <w:r>
               <w:rPr>
-                <w:rFonts w:cs="Book Antiqua"/>
+                <w:rFonts w:cs="Arial"/>
                 <w:b w:val="false"/>
                 <w:i w:val="false"/>
                 <w:sz w:val="20"/>
@@ -1379,7 +1379,7 @@
             </w:pPr>
             <w:r>
               <w:rPr>
-                <w:rFonts w:cs="Arial" w:ascii="Arial" w:hAnsi="Arial"/>
+                <w:rFonts w:cs="Arial"/>
                 <w:b/>
                 <w:i w:val="false"/>
                 <w:color w:val="002516"/>
@@ -1407,7 +1407,7 @@
             </w:pPr>
             <w:r>
               <w:rPr>
-                <w:rFonts w:cs="Book Antiqua"/>
+                <w:rFonts w:cs="Arial"/>
                 <w:b w:val="false"/>
                 <w:i w:val="false"/>
                 <w:sz w:val="20"/>
@@ -1440,7 +1440,7 @@
             </w:pPr>
             <w:r>
               <w:rPr>
-                <w:rFonts w:cs="Arial" w:ascii="Arial" w:hAnsi="Arial"/>
+                <w:rFonts w:cs="Arial"/>
                 <w:b/>
                 <w:i w:val="false"/>
                 <w:color w:val="002516"/>
@@ -1468,7 +1468,7 @@
             </w:pPr>
             <w:r>
               <w:rPr>
-                <w:rFonts w:cs="Book Antiqua"/>
+                <w:rFonts w:cs="Arial"/>
                 <w:b w:val="false"/>
                 <w:i w:val="false"/>
                 <w:sz w:val="20"/>
@@ -1501,7 +1501,7 @@
             </w:pPr>
             <w:r>
               <w:rPr>
-                <w:rFonts w:cs="Arial" w:ascii="Arial" w:hAnsi="Arial"/>
+                <w:rFonts w:cs="Arial"/>
                 <w:b/>
                 <w:i w:val="false"/>
                 <w:color w:val="002516"/>
@@ -1529,7 +1529,7 @@
             </w:pPr>
             <w:r>
               <w:rPr>
-                <w:rFonts w:cs="Book Antiqua"/>
+                <w:rFonts w:cs="Arial"/>
                 <w:b w:val="false"/>
                 <w:i w:val="false"/>
                 <w:sz w:val="20"/>
@@ -1557,7 +1557,7 @@
       </w:pPr>
       <w:r>
         <w:rPr>
-          <w:rFonts w:cs="Arial" w:ascii="Arial" w:hAnsi="Arial"/>
+          <w:rFonts w:cs="Arial"/>
           <w:b/>
           <w:i w:val="false"/>
           <w:color w:val="002516"/>
@@ -1607,7 +1607,7 @@
             </w:pPr>
             <w:r>
               <w:rPr>
-                <w:rFonts w:cs="Arial" w:ascii="Arial" w:hAnsi="Arial"/>
+                <w:rFonts w:cs="Arial"/>
                 <w:b/>
                 <w:i w:val="false"/>
                 <w:color w:val="FFFFFF"/>
@@ -1636,7 +1636,7 @@
             </w:pPr>
             <w:r>
               <w:rPr>
-                <w:rFonts w:cs="Arial" w:ascii="Arial" w:hAnsi="Arial"/>
+                <w:rFonts w:cs="Arial"/>
                 <w:b/>
                 <w:i w:val="false"/>
                 <w:color w:val="FFFFFF"/>
@@ -1670,7 +1670,7 @@
             </w:pPr>
             <w:r>
               <w:rPr>
-                <w:rFonts w:cs="Arial" w:ascii="Arial" w:hAnsi="Arial"/>
+                <w:rFonts w:cs="Arial"/>
                 <w:b/>
                 <w:i w:val="false"/>
                 <w:color w:val="002516"/>
@@ -1698,7 +1698,7 @@
             </w:pPr>
             <w:r>
               <w:rPr>
-                <w:rFonts w:cs="Book Antiqua"/>
+                <w:rFonts w:cs="Arial"/>
                 <w:b w:val="false"/>
                 <w:i w:val="false"/>
                 <w:sz w:val="20"/>
@@ -1731,7 +1731,7 @@
             </w:pPr>
             <w:r>
               <w:rPr>
-                <w:rFonts w:cs="Arial" w:ascii="Arial" w:hAnsi="Arial"/>
+                <w:rFonts w:cs="Arial"/>
                 <w:b/>
                 <w:i w:val="false"/>
                 <w:color w:val="002516"/>
@@ -1759,7 +1759,7 @@
             </w:pPr>
             <w:r>
               <w:rPr>
-                <w:rFonts w:cs="Book Antiqua"/>
+                <w:rFonts w:cs="Arial"/>
                 <w:b w:val="false"/>
                 <w:i w:val="false"/>
                 <w:sz w:val="20"/>
@@ -1792,7 +1792,7 @@
             </w:pPr>
             <w:r>
               <w:rPr>
-                <w:rFonts w:cs="Arial" w:ascii="Arial" w:hAnsi="Arial"/>
+                <w:rFonts w:cs="Arial"/>
                 <w:b/>
                 <w:i w:val="false"/>
                 <w:color w:val="002516"/>
@@ -1820,7 +1820,7 @@
             </w:pPr>
             <w:r>
               <w:rPr>
-                <w:rFonts w:cs="Book Antiqua"/>
+                <w:rFonts w:cs="Arial"/>
                 <w:b w:val="false"/>
                 <w:i w:val="false"/>
                 <w:sz w:val="20"/>
@@ -1853,7 +1853,7 @@
             </w:pPr>
             <w:r>
               <w:rPr>
-                <w:rFonts w:cs="Arial" w:ascii="Arial" w:hAnsi="Arial"/>
+                <w:rFonts w:cs="Arial"/>
                 <w:b/>
                 <w:i w:val="false"/>
                 <w:color w:val="002516"/>
@@ -1881,7 +1881,7 @@
             </w:pPr>
             <w:r>
               <w:rPr>
-                <w:rFonts w:cs="Book Antiqua"/>
+                <w:rFonts w:cs="Arial"/>
                 <w:b w:val="false"/>
                 <w:i w:val="false"/>
                 <w:sz w:val="20"/>
@@ -1911,7 +1911,7 @@
       </w:pPr>
       <w:r>
         <w:rPr>
-          <w:rFonts w:cs="Arial" w:ascii="Arial" w:hAnsi="Arial"/>
+          <w:rFonts w:cs="Arial"/>
           <w:b/>
           <w:i w:val="false"/>
           <w:color w:val="002516"/>
@@ -1933,7 +1933,7 @@
       </w:pPr>
       <w:r>
         <w:rPr>
-          <w:rFonts w:cs="Arial" w:ascii="Arial" w:hAnsi="Arial"/>
+          <w:rFonts w:cs="Arial"/>
           <w:b w:val="false"/>
         </w:rPr>
         <w:t>1.</w:t>
@@ -1941,7 +1941,7 @@
       </w:r>
       <w:r>
         <w:rPr>
-          <w:rFonts w:cs="Book Antiqua"/>
+          <w:rFonts w:cs="Arial"/>
           <w:b/>
           <w:i w:val="false"/>
         </w:rPr>
@@ -1949,7 +1949,7 @@
       </w:r>
       <w:r>
         <w:rPr>
-          <w:rFonts w:cs="Book Antiqua"/>
+          <w:rFonts w:cs="Arial"/>
           <w:b w:val="false"/>
           <w:i w:val="false"/>
         </w:rPr>
@@ -1969,7 +1969,7 @@
       </w:pPr>
       <w:r>
         <w:rPr>
-          <w:rFonts w:cs="Arial" w:ascii="Arial" w:hAnsi="Arial"/>
+          <w:rFonts w:cs="Arial"/>
           <w:b w:val="false"/>
         </w:rPr>
         <w:t>2.</w:t>
@@ -1977,7 +1977,7 @@
       </w:r>
       <w:r>
         <w:rPr>
-          <w:rFonts w:cs="Book Antiqua"/>
+          <w:rFonts w:cs="Arial"/>
           <w:b/>
           <w:i w:val="false"/>
         </w:rPr>
@@ -1985,7 +1985,7 @@
       </w:r>
       <w:r>
         <w:rPr>
-          <w:rFonts w:cs="Book Antiqua"/>
+          <w:rFonts w:cs="Arial"/>
           <w:b w:val="false"/>
           <w:i w:val="false"/>
         </w:rPr>
@@ -2005,7 +2005,7 @@
       </w:pPr>
       <w:r>
         <w:rPr>
-          <w:rFonts w:cs="Arial" w:ascii="Arial" w:hAnsi="Arial"/>
+          <w:rFonts w:cs="Arial"/>
           <w:b w:val="false"/>
         </w:rPr>
         <w:t>3.</w:t>
@@ -2013,7 +2013,7 @@
       </w:r>
       <w:r>
         <w:rPr>
-          <w:rFonts w:cs="Book Antiqua"/>
+          <w:rFonts w:cs="Arial"/>
           <w:b/>
           <w:i w:val="false"/>
         </w:rPr>
@@ -2021,7 +2021,7 @@
       </w:r>
       <w:r>
         <w:rPr>
-          <w:rFonts w:cs="Book Antiqua"/>
+          <w:rFonts w:cs="Arial"/>
           <w:b w:val="false"/>
           <w:i w:val="false"/>
         </w:rPr>
@@ -2035,7 +2035,7 @@
       </w:pPr>
       <w:r>
         <w:rPr>
-          <w:rFonts w:cs="Arial" w:ascii="Arial" w:hAnsi="Arial"/>
+          <w:rFonts w:cs="Arial"/>
           <w:b/>
           <w:i w:val="false"/>
           <w:color w:val="002516"/>
@@ -2053,7 +2053,7 @@
       </w:pPr>
       <w:r>
         <w:rPr>
-          <w:rFonts w:cs="Arial" w:ascii="Arial" w:hAnsi="Arial"/>
+          <w:rFonts w:cs="Arial"/>
           <w:b/>
           <w:i w:val="false"/>
           <w:color w:val="002516"/>
@@ -2069,7 +2069,7 @@
       </w:pPr>
       <w:r>
         <w:rPr>
-          <w:rFonts w:cs="Book Antiqua"/>
+          <w:rFonts w:cs="Arial"/>
           <w:b w:val="false"/>
           <w:i w:val="false"/>
         </w:rPr>
@@ -2085,7 +2085,7 @@
       </w:pPr>
       <w:r>
         <w:rPr>
-          <w:rFonts w:cs="Arial" w:ascii="Arial" w:hAnsi="Arial"/>
+          <w:rFonts w:cs="Arial"/>
           <w:b/>
           <w:i w:val="false"/>
           <w:color w:val="002516"/>
@@ -2101,7 +2101,7 @@
       </w:pPr>
       <w:r>
         <w:rPr>
-          <w:rFonts w:cs="Book Antiqua"/>
+          <w:rFonts w:cs="Arial"/>
           <w:b w:val="false"/>
           <w:i w:val="false"/>
         </w:rPr>
@@ -2117,7 +2117,7 @@
       </w:pPr>
       <w:r>
         <w:rPr>
-          <w:rFonts w:cs="Arial" w:ascii="Arial" w:hAnsi="Arial"/>
+          <w:rFonts w:cs="Arial"/>
           <w:b/>
           <w:i w:val="false"/>
           <w:color w:val="002516"/>
@@ -2133,7 +2133,7 @@
       </w:pPr>
       <w:r>
         <w:rPr>
-          <w:rFonts w:cs="Book Antiqua"/>
+          <w:rFonts w:cs="Arial"/>
           <w:b w:val="false"/>
           <w:i w:val="false"/>
         </w:rPr>
@@ -2149,7 +2149,7 @@
       </w:pPr>
       <w:r>
         <w:rPr>
-          <w:rFonts w:cs="Arial" w:ascii="Arial" w:hAnsi="Arial"/>
+          <w:rFonts w:cs="Arial"/>
           <w:b/>
           <w:i w:val="false"/>
           <w:color w:val="002516"/>
@@ -2171,7 +2171,7 @@
       </w:pPr>
       <w:r>
         <w:rPr>
-          <w:rFonts w:cs="Arial" w:ascii="Arial" w:hAnsi="Arial"/>
+          <w:rFonts w:cs="Arial"/>
           <w:b w:val="false"/>
         </w:rPr>
         <w:t>1.</w:t>
@@ -2179,7 +2179,7 @@
       </w:r>
       <w:r>
         <w:rPr>
-          <w:rFonts w:cs="Book Antiqua"/>
+          <w:rFonts w:cs="Arial"/>
           <w:b w:val="false"/>
           <w:i w:val="false"/>
         </w:rPr>
@@ -2199,7 +2199,7 @@
       </w:pPr>
       <w:r>
         <w:rPr>
-          <w:rFonts w:cs="Arial" w:ascii="Arial" w:hAnsi="Arial"/>
+          <w:rFonts w:cs="Arial"/>
           <w:b w:val="false"/>
         </w:rPr>
         <w:t>2.</w:t>
@@ -2207,7 +2207,7 @@
       </w:r>
       <w:r>
         <w:rPr>
-          <w:rFonts w:cs="Book Antiqua"/>
+          <w:rFonts w:cs="Arial"/>
           <w:b w:val="false"/>
           <w:i w:val="false"/>
         </w:rPr>
@@ -2227,7 +2227,7 @@
       </w:pPr>
       <w:r>
         <w:rPr>
-          <w:rFonts w:cs="Arial" w:ascii="Arial" w:hAnsi="Arial"/>
+          <w:rFonts w:cs="Arial"/>
           <w:b w:val="false"/>
         </w:rPr>
         <w:t>3.</w:t>
@@ -2235,7 +2235,7 @@
       </w:r>
       <w:r>
         <w:rPr>
-          <w:rFonts w:cs="Book Antiqua"/>
+          <w:rFonts w:cs="Arial"/>
           <w:b w:val="false"/>
           <w:i w:val="false"/>
         </w:rPr>
@@ -2255,7 +2255,7 @@
       </w:pPr>
       <w:r>
         <w:rPr>
-          <w:rFonts w:cs="Arial" w:ascii="Arial" w:hAnsi="Arial"/>
+          <w:rFonts w:cs="Arial"/>
           <w:b w:val="false"/>
         </w:rPr>
         <w:t>4.</w:t>
@@ -2263,7 +2263,7 @@
       </w:r>
       <w:r>
         <w:rPr>
-          <w:rFonts w:cs="Book Antiqua"/>
+          <w:rFonts w:cs="Arial"/>
           <w:b w:val="false"/>
           <w:i w:val="false"/>
         </w:rPr>
@@ -2283,7 +2283,7 @@
       </w:pPr>
       <w:r>
         <w:rPr>
-          <w:rFonts w:cs="Arial" w:ascii="Arial" w:hAnsi="Arial"/>
+          <w:rFonts w:cs="Arial"/>
           <w:b w:val="false"/>
         </w:rPr>
         <w:t>5.</w:t>
@@ -2291,7 +2291,7 @@
       </w:r>
       <w:r>
         <w:rPr>
-          <w:rFonts w:cs="Book Antiqua"/>
+          <w:rFonts w:cs="Arial"/>
           <w:b w:val="false"/>
           <w:i w:val="false"/>
         </w:rPr>
@@ -2311,7 +2311,7 @@
       </w:pPr>
       <w:r>
         <w:rPr>
-          <w:rFonts w:cs="Arial" w:ascii="Arial" w:hAnsi="Arial"/>
+          <w:rFonts w:cs="Arial"/>
           <w:b w:val="false"/>
         </w:rPr>
         <w:t>6.</w:t>
@@ -2319,7 +2319,7 @@
       </w:r>
       <w:r>
         <w:rPr>
-          <w:rFonts w:cs="Book Antiqua"/>
+          <w:rFonts w:cs="Arial"/>
           <w:b w:val="false"/>
           <w:i w:val="false"/>
         </w:rPr>
@@ -2333,7 +2333,7 @@
       </w:pPr>
       <w:r>
         <w:rPr>
-          <w:rFonts w:cs="Arial" w:ascii="Arial" w:hAnsi="Arial"/>
+          <w:rFonts w:cs="Arial"/>
           <w:b/>
           <w:i w:val="false"/>
           <w:color w:val="002516"/>
@@ -2351,7 +2351,7 @@
       </w:pPr>
       <w:r>
         <w:rPr>
-          <w:rFonts w:cs="Arial" w:ascii="Arial" w:hAnsi="Arial"/>
+          <w:rFonts w:cs="Arial"/>
           <w:b/>
           <w:i w:val="false"/>
           <w:color w:val="002516"/>
@@ -2369,7 +2369,7 @@
       </w:pPr>
       <w:r>
         <w:rPr>
-          <w:rFonts w:cs="Arial" w:ascii="Arial" w:hAnsi="Arial"/>
+          <w:rFonts w:cs="Arial"/>
           <w:b/>
           <w:i w:val="false"/>
           <w:color w:val="000000"/>
@@ -2385,7 +2385,7 @@
       </w:pPr>
       <w:r>
         <w:rPr>
-          <w:rFonts w:cs="Book Antiqua"/>
+          <w:rFonts w:cs="Arial"/>
           <w:b w:val="false"/>
           <w:i w:val="false"/>
         </w:rPr>
@@ -2399,7 +2399,7 @@
       </w:pPr>
       <w:r>
         <w:rPr>
-          <w:rFonts w:cs="Book Antiqua"/>
+          <w:rFonts w:cs="Arial"/>
           <w:b w:val="false"/>
           <w:i w:val="false"/>
         </w:rPr>
@@ -2415,7 +2415,7 @@
       </w:pPr>
       <w:r>
         <w:rPr>
-          <w:rFonts w:cs="Arial" w:ascii="Arial" w:hAnsi="Arial"/>
+          <w:rFonts w:cs="Arial"/>
           <w:b/>
           <w:i w:val="false"/>
           <w:color w:val="000000"/>
@@ -2431,7 +2431,7 @@
       </w:pPr>
       <w:r>
         <w:rPr>
-          <w:rFonts w:cs="Book Antiqua"/>
+          <w:rFonts w:cs="Arial"/>
           <w:b w:val="false"/>
           <w:i w:val="false"/>
         </w:rPr>
@@ -2445,7 +2445,7 @@
       </w:pPr>
       <w:r>
         <w:rPr>
-          <w:rFonts w:cs="Book Antiqua"/>
+          <w:rFonts w:cs="Arial"/>
           <w:b w:val="false"/>
           <w:i w:val="false"/>
         </w:rPr>
@@ -2461,7 +2461,7 @@
       </w:pPr>
       <w:r>
         <w:rPr>
-          <w:rFonts w:cs="Arial" w:ascii="Arial" w:hAnsi="Arial"/>
+          <w:rFonts w:cs="Arial"/>
           <w:b/>
           <w:i w:val="false"/>
           <w:color w:val="000000"/>
@@ -2477,7 +2477,7 @@
       </w:pPr>
       <w:r>
         <w:rPr>
-          <w:rFonts w:cs="Book Antiqua"/>
+          <w:rFonts w:cs="Arial"/>
           <w:b w:val="false"/>
           <w:i w:val="false"/>
         </w:rPr>
@@ -2495,7 +2495,7 @@
       </w:pPr>
       <w:r>
         <w:rPr>
-          <w:rFonts w:cs="Book Antiqua"/>
+          <w:rFonts w:cs="Arial"/>
           <w:b w:val="false"/>
           <w:i w:val="false"/>
         </w:rPr>
@@ -2546,7 +2546,7 @@
     </w:pPr>
     <w:r>
       <w:rPr>
-        <w:rFonts w:cs="Arial" w:ascii="Arial" w:hAnsi="Arial"/>
+        <w:rFonts w:cs="Arial"/>
         <w:b/>
         <w:color w:val="000000"/>
         <w:sz w:val="20"/>
@@ -2567,7 +2567,7 @@
     </w:pPr>
     <w:r>
       <w:rPr>
-        <w:rFonts w:cs="Arial" w:ascii="Arial" w:hAnsi="Arial"/>
+        <w:rFonts w:cs="Arial"/>
         <w:color w:val="000000"/>
         <w:sz w:val="17"/>
       </w:rPr>
@@ -2579,7 +2579,7 @@
     </w:r>
     <w:r>
       <w:rPr>
-        <w:rFonts w:cs="Arial" w:ascii="Arial" w:hAnsi="Arial"/>
+        <w:rFonts w:cs="Arial"/>
         <w:sz w:val="17"/>
       </w:rPr>
       <w:fldChar w:fldCharType="begin"/>
@@ -2587,34 +2587,34 @@
     <w:r>
       <w:rPr>
         <w:sz w:val="17"/>
-        <w:rFonts w:cs="Arial" w:ascii="Arial" w:hAnsi="Arial"/>
+        <w:rFonts w:cs="Arial"/>
       </w:rPr>
       <w:instrText xml:space="preserve"> PAGE </w:instrText>
     </w:r>
     <w:r>
       <w:rPr>
         <w:sz w:val="17"/>
-        <w:rFonts w:cs="Arial" w:ascii="Arial" w:hAnsi="Arial"/>
+        <w:rFonts w:cs="Arial"/>
       </w:rPr>
       <w:fldChar w:fldCharType="separate"/>
     </w:r>
     <w:r>
       <w:rPr>
         <w:sz w:val="17"/>
-        <w:rFonts w:cs="Arial" w:ascii="Arial" w:hAnsi="Arial"/>
+        <w:rFonts w:cs="Arial"/>
       </w:rPr>
       <w:t>3</w:t>
     </w:r>
     <w:r>
       <w:rPr>
         <w:sz w:val="17"/>
-        <w:rFonts w:cs="Arial" w:ascii="Arial" w:hAnsi="Arial"/>
+        <w:rFonts w:cs="Arial"/>
       </w:rPr>
       <w:fldChar w:fldCharType="end"/>
     </w:r>
     <w:r>
       <w:rPr>
-        <w:rFonts w:cs="Arial" w:ascii="Arial" w:hAnsi="Arial"/>
+        <w:rFonts w:cs="Arial"/>
         <w:color w:val="000000"/>
         <w:sz w:val="17"/>
       </w:rPr>
@@ -2622,7 +2622,7 @@
     </w:r>
     <w:r>
       <w:rPr>
-        <w:rFonts w:cs="Arial" w:ascii="Arial" w:hAnsi="Arial"/>
+        <w:rFonts w:cs="Arial"/>
         <w:sz w:val="17"/>
       </w:rPr>
       <w:fldChar w:fldCharType="begin"/>
@@ -2630,28 +2630,28 @@
     <w:r>
       <w:rPr>
         <w:sz w:val="17"/>
-        <w:rFonts w:cs="Arial" w:ascii="Arial" w:hAnsi="Arial"/>
+        <w:rFonts w:cs="Arial"/>
       </w:rPr>
       <w:instrText xml:space="preserve"> NUMPAGES </w:instrText>
     </w:r>
     <w:r>
       <w:rPr>
         <w:sz w:val="17"/>
-        <w:rFonts w:cs="Arial" w:ascii="Arial" w:hAnsi="Arial"/>
+        <w:rFonts w:cs="Arial"/>
       </w:rPr>
       <w:fldChar w:fldCharType="separate"/>
     </w:r>
     <w:r>
       <w:rPr>
         <w:sz w:val="17"/>
-        <w:rFonts w:cs="Arial" w:ascii="Arial" w:hAnsi="Arial"/>
+        <w:rFonts w:cs="Arial"/>
       </w:rPr>
       <w:t>3</w:t>
     </w:r>
     <w:r>
       <w:rPr>
         <w:sz w:val="17"/>
-        <w:rFonts w:cs="Arial" w:ascii="Arial" w:hAnsi="Arial"/>
+        <w:rFonts w:cs="Arial"/>
       </w:rPr>
       <w:fldChar w:fldCharType="end"/>
     </w:r>
@@ -2670,7 +2670,7 @@
     </w:pPr>
     <w:r>
       <w:rPr>
-        <w:rFonts w:cs="Arial" w:ascii="Arial" w:hAnsi="Arial"/>
+        <w:rFonts w:cs="Arial"/>
         <w:b/>
         <w:color w:val="000000"/>
         <w:sz w:val="20"/>
@@ -2691,7 +2691,7 @@
     </w:pPr>
     <w:r>
       <w:rPr>
-        <w:rFonts w:cs="Arial" w:ascii="Arial" w:hAnsi="Arial"/>
+        <w:rFonts w:cs="Arial"/>
         <w:color w:val="000000"/>
         <w:sz w:val="17"/>
       </w:rPr>
@@ -2703,7 +2703,7 @@
     </w:r>
     <w:r>
       <w:rPr>
-        <w:rFonts w:cs="Arial" w:ascii="Arial" w:hAnsi="Arial"/>
+        <w:rFonts w:cs="Arial"/>
         <w:sz w:val="17"/>
       </w:rPr>
       <w:fldChar w:fldCharType="begin"/>
@@ -2711,34 +2711,34 @@
     <w:r>
       <w:rPr>
         <w:sz w:val="17"/>
-        <w:rFonts w:cs="Arial" w:ascii="Arial" w:hAnsi="Arial"/>
+        <w:rFonts w:cs="Arial"/>
       </w:rPr>
       <w:instrText xml:space="preserve"> PAGE </w:instrText>
     </w:r>
     <w:r>
       <w:rPr>
         <w:sz w:val="17"/>
-        <w:rFonts w:cs="Arial" w:ascii="Arial" w:hAnsi="Arial"/>
+        <w:rFonts w:cs="Arial"/>
       </w:rPr>
       <w:fldChar w:fldCharType="separate"/>
     </w:r>
     <w:r>
       <w:rPr>
         <w:sz w:val="17"/>
-        <w:rFonts w:cs="Arial" w:ascii="Arial" w:hAnsi="Arial"/>
+        <w:rFonts w:cs="Arial"/>
       </w:rPr>
       <w:t>3</w:t>
     </w:r>
     <w:r>
       <w:rPr>
         <w:sz w:val="17"/>
-        <w:rFonts w:cs="Arial" w:ascii="Arial" w:hAnsi="Arial"/>
+        <w:rFonts w:cs="Arial"/>
       </w:rPr>
       <w:fldChar w:fldCharType="end"/>
     </w:r>
     <w:r>
       <w:rPr>
-        <w:rFonts w:cs="Arial" w:ascii="Arial" w:hAnsi="Arial"/>
+        <w:rFonts w:cs="Arial"/>
         <w:color w:val="000000"/>
         <w:sz w:val="17"/>
       </w:rPr>
@@ -2746,7 +2746,7 @@
     </w:r>
     <w:r>
       <w:rPr>
-        <w:rFonts w:cs="Arial" w:ascii="Arial" w:hAnsi="Arial"/>
+        <w:rFonts w:cs="Arial"/>
         <w:sz w:val="17"/>
       </w:rPr>
       <w:fldChar w:fldCharType="begin"/>
@@ -2754,28 +2754,28 @@
     <w:r>
       <w:rPr>
         <w:sz w:val="17"/>
-        <w:rFonts w:cs="Arial" w:ascii="Arial" w:hAnsi="Arial"/>
+        <w:rFonts w:cs="Arial"/>
       </w:rPr>
       <w:instrText xml:space="preserve"> NUMPAGES </w:instrText>
     </w:r>
     <w:r>
       <w:rPr>
         <w:sz w:val="17"/>
-        <w:rFonts w:cs="Arial" w:ascii="Arial" w:hAnsi="Arial"/>
+        <w:rFonts w:cs="Arial"/>
       </w:rPr>
       <w:fldChar w:fldCharType="separate"/>
     </w:r>
     <w:r>
       <w:rPr>
         <w:sz w:val="17"/>
-        <w:rFonts w:cs="Arial" w:ascii="Arial" w:hAnsi="Arial"/>
+        <w:rFonts w:cs="Arial"/>
       </w:rPr>
       <w:t>3</w:t>
     </w:r>
     <w:r>
       <w:rPr>
         <w:sz w:val="17"/>
-        <w:rFonts w:cs="Arial" w:ascii="Arial" w:hAnsi="Arial"/>
+        <w:rFonts w:cs="Arial"/>
       </w:rPr>
       <w:fldChar w:fldCharType="end"/>
     </w:r>
@@ -2808,7 +2808,7 @@
     </w:pPr>
     <w:r>
       <w:rPr>
-        <w:rFonts w:cs="Arial" w:ascii="Arial" w:hAnsi="Arial"/>
+        <w:rFonts w:cs="Arial"/>
         <w:b/>
         <w:color w:val="000000"/>
         <w:sz w:val="20"/>
@@ -2830,7 +2830,7 @@
     </w:pPr>
     <w:r>
       <w:rPr>
-        <w:rFonts w:cs="Arial" w:ascii="Arial" w:hAnsi="Arial"/>
+        <w:rFonts w:cs="Arial"/>
         <w:b/>
         <w:color w:val="000000"/>
         <w:sz w:val="20"/>
@@ -2846,7 +2846,7 @@
   <w:docDefaults>
     <w:rPrDefault>
       <w:rPr>
-        <w:rFonts w:ascii="Book Antiqua" w:hAnsi="Book Antiqua" w:eastAsia="WenQuanYi Zen Hei" w:cs="Book Antiqua"/>
+        <w:rFonts w:ascii="Arial" w:hAnsi="Arial" w:eastAsia="WenQuanYi Zen Hei" w:cs="Arial"/>
         <w:sz w:val="22"/>
         <w:szCs w:val="22"/>
         <w:lang w:val="en-US" w:eastAsia="en-US" w:bidi="ar-SA"/>
@@ -3008,7 +3008,7 @@
       <w:jc w:val="left"/>
     </w:pPr>
     <w:rPr>
-      <w:rFonts w:ascii="Book Antiqua" w:hAnsi="Book Antiqua" w:cs="Book Antiqua" w:eastAsia="WenQuanYi Zen Hei"/>
+      <w:rFonts w:ascii="Arial" w:hAnsi="Arial" w:cs="Arial" w:eastAsia="WenQuanYi Zen Hei"/>
       <w:color w:val="000000"/>
       <w:kern w:val="0"/>
       <w:sz w:val="21"/>
@@ -3030,7 +3030,7 @@
       <w:outlineLvl w:val="0"/>
     </w:pPr>
     <w:rPr>
-      <w:rFonts w:ascii="Book Antiqua" w:hAnsi="Book Antiqua" w:cs="Book Antiqua"/>
+      <w:rFonts w:ascii="Arial" w:hAnsi="Arial" w:cs="Arial"/>
       <w:b/>
       <w:color w:val="002516"/>
       <w:sz w:val="24"/>

</xml_diff>

<commit_message>
Rename the Revised Entry table headers to Entry
Co-Authored-By: Claude Fable 5.1 <noreply@anthropic.com>
Claude-Session: https://claude.ai/code/session_01LgFPs3fMSncBgbYQ3PfA3o
</commit_message>
<xml_diff>
--- a/output/elda-lead-teams-data-sheet.docx
+++ b/output/elda-lead-teams-data-sheet.docx
@@ -241,7 +241,7 @@
                 <w:color w:val="FFFFFF"/>
                 <w:sz w:val="18"/>
               </w:rPr>
-              <w:t>Revised Entry</w:t>
+              <w:t>Entry</w:t>
             </w:r>
           </w:p>
         </w:tc>
@@ -1642,7 +1642,7 @@
                 <w:color w:val="FFFFFF"/>
                 <w:sz w:val="18"/>
               </w:rPr>
-              <w:t>Revised Entry</w:t>
+              <w:t>Entry</w:t>
             </w:r>
           </w:p>
         </w:tc>

</xml_diff>

<commit_message>
Add the revised A18008 ELDA Lead Leaders course data sheet
The data sheet builder now takes the sheet name as an argument and
produces both ELDA sheets from one generator. Short field tables are
kept in one piece rather than splitting across pages.

Co-Authored-By: Claude Fable 5.1 <noreply@anthropic.com>
Claude-Session: https://claude.ai/code/session_01LgFPs3fMSncBgbYQ3PfA3o
</commit_message>
<xml_diff>
--- a/output/elda-lead-teams-data-sheet.docx
+++ b/output/elda-lead-teams-data-sheet.docx
@@ -1067,6 +1067,7 @@
           <w:p>
             <w:pPr>
               <w:pStyle w:val="Normal"/>
+              <w:keepNext w:val="true"/>
               <w:spacing w:lineRule="auto" w:line="252" w:before="0" w:after="0"/>
               <w:rPr/>
             </w:pPr>
@@ -1096,6 +1097,7 @@
           <w:p>
             <w:pPr>
               <w:pStyle w:val="Normal"/>
+              <w:keepNext w:val="true"/>
               <w:spacing w:lineRule="auto" w:line="252" w:before="0" w:after="0"/>
               <w:rPr/>
             </w:pPr>
@@ -1130,6 +1132,7 @@
           <w:p>
             <w:pPr>
               <w:pStyle w:val="Normal"/>
+              <w:keepNext w:val="true"/>
               <w:spacing w:lineRule="auto" w:line="252" w:before="0" w:after="0"/>
               <w:rPr/>
             </w:pPr>
@@ -1158,6 +1161,7 @@
           <w:p>
             <w:pPr>
               <w:pStyle w:val="Normal"/>
+              <w:keepNext w:val="true"/>
               <w:spacing w:lineRule="auto" w:line="252" w:before="0" w:after="0"/>
               <w:rPr/>
             </w:pPr>
@@ -1191,6 +1195,7 @@
           <w:p>
             <w:pPr>
               <w:pStyle w:val="Normal"/>
+              <w:keepNext w:val="true"/>
               <w:spacing w:lineRule="auto" w:line="252" w:before="0" w:after="0"/>
               <w:rPr/>
             </w:pPr>
@@ -1219,6 +1224,7 @@
           <w:p>
             <w:pPr>
               <w:pStyle w:val="Normal"/>
+              <w:keepNext w:val="true"/>
               <w:spacing w:lineRule="auto" w:line="252" w:before="0" w:after="0"/>
               <w:rPr/>
             </w:pPr>
@@ -1252,6 +1258,7 @@
           <w:p>
             <w:pPr>
               <w:pStyle w:val="Normal"/>
+              <w:keepNext w:val="true"/>
               <w:spacing w:lineRule="auto" w:line="252" w:before="0" w:after="0"/>
               <w:rPr/>
             </w:pPr>
@@ -1280,6 +1287,7 @@
           <w:p>
             <w:pPr>
               <w:pStyle w:val="Normal"/>
+              <w:keepNext w:val="true"/>
               <w:spacing w:lineRule="auto" w:line="252" w:before="0" w:after="0"/>
               <w:rPr/>
             </w:pPr>
@@ -1313,6 +1321,7 @@
           <w:p>
             <w:pPr>
               <w:pStyle w:val="Normal"/>
+              <w:keepNext w:val="true"/>
               <w:spacing w:lineRule="auto" w:line="252" w:before="0" w:after="0"/>
               <w:rPr/>
             </w:pPr>
@@ -1341,6 +1350,7 @@
           <w:p>
             <w:pPr>
               <w:pStyle w:val="Normal"/>
+              <w:keepNext w:val="true"/>
               <w:spacing w:lineRule="auto" w:line="252" w:before="0" w:after="0"/>
               <w:rPr/>
             </w:pPr>
@@ -1374,6 +1384,7 @@
           <w:p>
             <w:pPr>
               <w:pStyle w:val="Normal"/>
+              <w:keepNext w:val="true"/>
               <w:spacing w:lineRule="auto" w:line="252" w:before="0" w:after="0"/>
               <w:rPr/>
             </w:pPr>
@@ -1402,6 +1413,7 @@
           <w:p>
             <w:pPr>
               <w:pStyle w:val="Normal"/>
+              <w:keepNext w:val="true"/>
               <w:spacing w:lineRule="auto" w:line="252" w:before="0" w:after="0"/>
               <w:rPr/>
             </w:pPr>
@@ -1435,6 +1447,7 @@
           <w:p>
             <w:pPr>
               <w:pStyle w:val="Normal"/>
+              <w:keepNext w:val="true"/>
               <w:spacing w:lineRule="auto" w:line="252" w:before="0" w:after="0"/>
               <w:rPr/>
             </w:pPr>
@@ -1463,6 +1476,7 @@
           <w:p>
             <w:pPr>
               <w:pStyle w:val="Normal"/>
+              <w:keepNext w:val="true"/>
               <w:spacing w:lineRule="auto" w:line="252" w:before="0" w:after="0"/>
               <w:rPr/>
             </w:pPr>
@@ -1602,6 +1616,7 @@
           <w:p>
             <w:pPr>
               <w:pStyle w:val="Normal"/>
+              <w:keepNext w:val="true"/>
               <w:spacing w:lineRule="auto" w:line="252" w:before="0" w:after="0"/>
               <w:rPr/>
             </w:pPr>
@@ -1631,6 +1646,7 @@
           <w:p>
             <w:pPr>
               <w:pStyle w:val="Normal"/>
+              <w:keepNext w:val="true"/>
               <w:spacing w:lineRule="auto" w:line="252" w:before="0" w:after="0"/>
               <w:rPr/>
             </w:pPr>
@@ -1665,6 +1681,7 @@
           <w:p>
             <w:pPr>
               <w:pStyle w:val="Normal"/>
+              <w:keepNext w:val="true"/>
               <w:spacing w:lineRule="auto" w:line="252" w:before="0" w:after="0"/>
               <w:rPr/>
             </w:pPr>
@@ -1693,6 +1710,7 @@
           <w:p>
             <w:pPr>
               <w:pStyle w:val="Normal"/>
+              <w:keepNext w:val="true"/>
               <w:spacing w:lineRule="auto" w:line="252" w:before="0" w:after="0"/>
               <w:rPr/>
             </w:pPr>
@@ -1726,6 +1744,7 @@
           <w:p>
             <w:pPr>
               <w:pStyle w:val="Normal"/>
+              <w:keepNext w:val="true"/>
               <w:spacing w:lineRule="auto" w:line="252" w:before="0" w:after="0"/>
               <w:rPr/>
             </w:pPr>
@@ -1754,6 +1773,7 @@
           <w:p>
             <w:pPr>
               <w:pStyle w:val="Normal"/>
+              <w:keepNext w:val="true"/>
               <w:spacing w:lineRule="auto" w:line="252" w:before="0" w:after="0"/>
               <w:rPr/>
             </w:pPr>
@@ -1787,6 +1807,7 @@
           <w:p>
             <w:pPr>
               <w:pStyle w:val="Normal"/>
+              <w:keepNext w:val="true"/>
               <w:spacing w:lineRule="auto" w:line="252" w:before="0" w:after="0"/>
               <w:rPr/>
             </w:pPr>
@@ -1815,6 +1836,7 @@
           <w:p>
             <w:pPr>
               <w:pStyle w:val="Normal"/>
+              <w:keepNext w:val="true"/>
               <w:spacing w:lineRule="auto" w:line="252" w:before="0" w:after="0"/>
               <w:rPr/>
             </w:pPr>

</xml_diff>